<commit_message>
Fill team names and IDs into the report cover, author block and deck title slide
Co-Authored-By: Claude Fable 5.1 <noreply@anthropic.com>
</commit_message>
<xml_diff>
--- a/TERRARIUM-Report.docx
+++ b/TERRARIUM-Report.docx
@@ -771,7 +771,7 @@
                 <w:sz w:val="22"/>
                 <w:szCs w:val="22"/>
               </w:rPr>
-              <w:t xml:space="preserve"/>
+              <w:t xml:space="preserve">Kishor Tarafder</w:t>
             </w:r>
           </w:p>
         </w:tc>
@@ -798,7 +798,7 @@
                 <w:sz w:val="22"/>
                 <w:szCs w:val="22"/>
               </w:rPr>
-              <w:t xml:space="preserve"/>
+              <w:t xml:space="preserve">23-54520-3</w:t>
             </w:r>
           </w:p>
         </w:tc>
@@ -825,7 +825,7 @@
                 <w:sz w:val="22"/>
                 <w:szCs w:val="22"/>
               </w:rPr>
-              <w:t xml:space="preserve"/>
+              <w:t xml:space="preserve">BSc in EEE</w:t>
             </w:r>
           </w:p>
         </w:tc>
@@ -912,7 +912,7 @@
                 <w:sz w:val="22"/>
                 <w:szCs w:val="22"/>
               </w:rPr>
-              <w:t xml:space="preserve"/>
+              <w:t xml:space="preserve">Tahomina Era</w:t>
             </w:r>
           </w:p>
         </w:tc>
@@ -939,7 +939,7 @@
                 <w:sz w:val="22"/>
                 <w:szCs w:val="22"/>
               </w:rPr>
-              <w:t xml:space="preserve"/>
+              <w:t xml:space="preserve">23-55027-3</w:t>
             </w:r>
           </w:p>
         </w:tc>
@@ -966,7 +966,7 @@
                 <w:sz w:val="22"/>
                 <w:szCs w:val="22"/>
               </w:rPr>
-              <w:t xml:space="preserve"/>
+              <w:t xml:space="preserve">BSc in EEE</w:t>
             </w:r>
           </w:p>
         </w:tc>
@@ -1053,7 +1053,7 @@
                 <w:sz w:val="22"/>
                 <w:szCs w:val="22"/>
               </w:rPr>
-              <w:t xml:space="preserve"/>
+              <w:t xml:space="preserve">MD. Shakhawat Hossen</w:t>
             </w:r>
           </w:p>
         </w:tc>
@@ -1080,7 +1080,7 @@
                 <w:sz w:val="22"/>
                 <w:szCs w:val="22"/>
               </w:rPr>
-              <w:t xml:space="preserve"/>
+              <w:t xml:space="preserve">23-54483-3</w:t>
             </w:r>
           </w:p>
         </w:tc>
@@ -1107,7 +1107,7 @@
                 <w:sz w:val="22"/>
                 <w:szCs w:val="22"/>
               </w:rPr>
-              <w:t xml:space="preserve"/>
+              <w:t xml:space="preserve">BSc in EEE</w:t>
             </w:r>
           </w:p>
         </w:tc>
@@ -1194,7 +1194,7 @@
                 <w:sz w:val="22"/>
                 <w:szCs w:val="22"/>
               </w:rPr>
-              <w:t xml:space="preserve"/>
+              <w:t xml:space="preserve">Avishek Saha</w:t>
             </w:r>
           </w:p>
         </w:tc>
@@ -1221,7 +1221,7 @@
                 <w:sz w:val="22"/>
                 <w:szCs w:val="22"/>
               </w:rPr>
-              <w:t xml:space="preserve"/>
+              <w:t xml:space="preserve">23-54508-3</w:t>
             </w:r>
           </w:p>
         </w:tc>
@@ -1248,7 +1248,7 @@
                 <w:sz w:val="22"/>
                 <w:szCs w:val="22"/>
               </w:rPr>
-              <w:t xml:space="preserve"/>
+              <w:t xml:space="preserve">BSc in EEE</w:t>
             </w:r>
           </w:p>
         </w:tc>
@@ -2949,14 +2949,15 @@
         </w:tblBorders>
       </w:tblPr>
       <w:tblGrid>
-        <w:gridCol w:w="3364"/>
-        <w:gridCol w:w="3364"/>
-        <w:gridCol w:w="3364"/>
+        <w:gridCol w:w="2523"/>
+        <w:gridCol w:w="2523"/>
+        <w:gridCol w:w="2523"/>
+        <w:gridCol w:w="2523"/>
       </w:tblGrid>
       <w:tr>
         <w:tc>
           <w:tcPr>
-            <w:tcW w:type="dxa" w:w="3364"/>
+            <w:tcW w:type="dxa" w:w="2523"/>
           </w:tcPr>
           <w:p>
             <w:pPr>
@@ -2970,7 +2971,7 @@
                 <w:sz w:val="22"/>
                 <w:szCs w:val="22"/>
               </w:rPr>
-              <w:t xml:space="preserve">1st [Student Name]</w:t>
+              <w:t xml:space="preserve">1st Kishor Tarafder</w:t>
             </w:r>
           </w:p>
           <w:p>
@@ -2985,7 +2986,7 @@
                 <w:sz w:val="20"/>
                 <w:szCs w:val="20"/>
               </w:rPr>
-              <w:t xml:space="preserve">Department of Electrical and Electronic Engineering</w:t>
+              <w:t xml:space="preserve">Dept. of Electrical and Electronic Engineering</w:t>
             </w:r>
           </w:p>
           <w:p>
@@ -3030,13 +3031,13 @@
                 <w:sz w:val="20"/>
                 <w:szCs w:val="20"/>
               </w:rPr>
-              <w:t xml:space="preserve">[Student ID / email]</w:t>
-            </w:r>
-          </w:p>
-        </w:tc>
-        <w:tc>
-          <w:tcPr>
-            <w:tcW w:type="dxa" w:w="3364"/>
+              <w:t xml:space="preserve">23-54520-3@student.aiub.edu</w:t>
+            </w:r>
+          </w:p>
+        </w:tc>
+        <w:tc>
+          <w:tcPr>
+            <w:tcW w:type="dxa" w:w="2523"/>
           </w:tcPr>
           <w:p>
             <w:pPr>
@@ -3050,7 +3051,7 @@
                 <w:sz w:val="22"/>
                 <w:szCs w:val="22"/>
               </w:rPr>
-              <w:t xml:space="preserve">2nd [Student Name]</w:t>
+              <w:t xml:space="preserve">2nd Tahomina Era</w:t>
             </w:r>
           </w:p>
           <w:p>
@@ -3065,7 +3066,7 @@
                 <w:sz w:val="20"/>
                 <w:szCs w:val="20"/>
               </w:rPr>
-              <w:t xml:space="preserve">Department of Electrical and Electronic Engineering</w:t>
+              <w:t xml:space="preserve">Dept. of Electrical and Electronic Engineering</w:t>
             </w:r>
           </w:p>
           <w:p>
@@ -3110,13 +3111,13 @@
                 <w:sz w:val="20"/>
                 <w:szCs w:val="20"/>
               </w:rPr>
-              <w:t xml:space="preserve">[Student ID / email]</w:t>
-            </w:r>
-          </w:p>
-        </w:tc>
-        <w:tc>
-          <w:tcPr>
-            <w:tcW w:type="dxa" w:w="3364"/>
+              <w:t xml:space="preserve">23-55027-3@student.aiub.edu</w:t>
+            </w:r>
+          </w:p>
+        </w:tc>
+        <w:tc>
+          <w:tcPr>
+            <w:tcW w:type="dxa" w:w="2523"/>
           </w:tcPr>
           <w:p>
             <w:pPr>
@@ -3130,7 +3131,7 @@
                 <w:sz w:val="22"/>
                 <w:szCs w:val="22"/>
               </w:rPr>
-              <w:t xml:space="preserve">3rd [Student Name]</w:t>
+              <w:t xml:space="preserve">3rd MD. Shakhawat Hossen</w:t>
             </w:r>
           </w:p>
           <w:p>
@@ -3145,7 +3146,7 @@
                 <w:sz w:val="20"/>
                 <w:szCs w:val="20"/>
               </w:rPr>
-              <w:t xml:space="preserve">Department of Electrical and Electronic Engineering</w:t>
+              <w:t xml:space="preserve">Dept. of Electrical and Electronic Engineering</w:t>
             </w:r>
           </w:p>
           <w:p>
@@ -3190,7 +3191,87 @@
                 <w:sz w:val="20"/>
                 <w:szCs w:val="20"/>
               </w:rPr>
-              <w:t xml:space="preserve">[Student ID / email]</w:t>
+              <w:t xml:space="preserve">23-54483-3@student.aiub.edu</w:t>
+            </w:r>
+          </w:p>
+        </w:tc>
+        <w:tc>
+          <w:tcPr>
+            <w:tcW w:type="dxa" w:w="2523"/>
+          </w:tcPr>
+          <w:p>
+            <w:pPr>
+              <w:spacing w:after="0"/>
+              <w:jc w:val="center"/>
+            </w:pPr>
+            <w:r>
+              <w:rPr>
+                <w:i w:val="false"/>
+                <w:iCs w:val="false"/>
+                <w:sz w:val="22"/>
+                <w:szCs w:val="22"/>
+              </w:rPr>
+              <w:t xml:space="preserve">4th Avishek Saha</w:t>
+            </w:r>
+          </w:p>
+          <w:p>
+            <w:pPr>
+              <w:spacing w:after="0"/>
+              <w:jc w:val="center"/>
+            </w:pPr>
+            <w:r>
+              <w:rPr>
+                <w:i/>
+                <w:iCs/>
+                <w:sz w:val="20"/>
+                <w:szCs w:val="20"/>
+              </w:rPr>
+              <w:t xml:space="preserve">Dept. of Electrical and Electronic Engineering</w:t>
+            </w:r>
+          </w:p>
+          <w:p>
+            <w:pPr>
+              <w:spacing w:after="0"/>
+              <w:jc w:val="center"/>
+            </w:pPr>
+            <w:r>
+              <w:rPr>
+                <w:i/>
+                <w:iCs/>
+                <w:sz w:val="20"/>
+                <w:szCs w:val="20"/>
+              </w:rPr>
+              <w:t xml:space="preserve">American International University-Bangladesh</w:t>
+            </w:r>
+          </w:p>
+          <w:p>
+            <w:pPr>
+              <w:spacing w:after="0"/>
+              <w:jc w:val="center"/>
+            </w:pPr>
+            <w:r>
+              <w:rPr>
+                <w:i/>
+                <w:iCs/>
+                <w:sz w:val="20"/>
+                <w:szCs w:val="20"/>
+              </w:rPr>
+              <w:t xml:space="preserve">Dhaka, Bangladesh</w:t>
+            </w:r>
+          </w:p>
+          <w:p>
+            <w:pPr>
+              <w:spacing w:after="0"/>
+              <w:jc w:val="center"/>
+            </w:pPr>
+            <w:r>
+              <w:rPr>
+                <w:i w:val="false"/>
+                <w:iCs w:val="false"/>
+                <w:sz w:val="20"/>
+                <w:szCs w:val="20"/>
+              </w:rPr>
+              <w:t xml:space="preserve">23-54508-3@student.aiub.edu</w:t>
             </w:r>
           </w:p>
         </w:tc>

</xml_diff>

<commit_message>
Team program and author department set to CSE in report and deck
Co-Authored-By: Claude Fable 5.1 <noreply@anthropic.com>
</commit_message>
<xml_diff>
--- a/TERRARIUM-Report.docx
+++ b/TERRARIUM-Report.docx
@@ -825,7 +825,7 @@
                 <w:sz w:val="22"/>
                 <w:szCs w:val="22"/>
               </w:rPr>
-              <w:t xml:space="preserve">BSc in EEE</w:t>
+              <w:t xml:space="preserve">BSc in CSE</w:t>
             </w:r>
           </w:p>
         </w:tc>
@@ -966,7 +966,7 @@
                 <w:sz w:val="22"/>
                 <w:szCs w:val="22"/>
               </w:rPr>
-              <w:t xml:space="preserve">BSc in EEE</w:t>
+              <w:t xml:space="preserve">BSc in CSE</w:t>
             </w:r>
           </w:p>
         </w:tc>
@@ -1107,7 +1107,7 @@
                 <w:sz w:val="22"/>
                 <w:szCs w:val="22"/>
               </w:rPr>
-              <w:t xml:space="preserve">BSc in EEE</w:t>
+              <w:t xml:space="preserve">BSc in CSE</w:t>
             </w:r>
           </w:p>
         </w:tc>
@@ -1248,7 +1248,7 @@
                 <w:sz w:val="22"/>
                 <w:szCs w:val="22"/>
               </w:rPr>
-              <w:t xml:space="preserve">BSc in EEE</w:t>
+              <w:t xml:space="preserve">BSc in CSE</w:t>
             </w:r>
           </w:p>
         </w:tc>
@@ -2986,7 +2986,7 @@
                 <w:sz w:val="20"/>
                 <w:szCs w:val="20"/>
               </w:rPr>
-              <w:t xml:space="preserve">Dept. of Electrical and Electronic Engineering</w:t>
+              <w:t xml:space="preserve">Dept. of Computer Science and Engineering</w:t>
             </w:r>
           </w:p>
           <w:p>
@@ -3066,7 +3066,7 @@
                 <w:sz w:val="20"/>
                 <w:szCs w:val="20"/>
               </w:rPr>
-              <w:t xml:space="preserve">Dept. of Electrical and Electronic Engineering</w:t>
+              <w:t xml:space="preserve">Dept. of Computer Science and Engineering</w:t>
             </w:r>
           </w:p>
           <w:p>
@@ -3146,7 +3146,7 @@
                 <w:sz w:val="20"/>
                 <w:szCs w:val="20"/>
               </w:rPr>
-              <w:t xml:space="preserve">Dept. of Electrical and Electronic Engineering</w:t>
+              <w:t xml:space="preserve">Dept. of Computer Science and Engineering</w:t>
             </w:r>
           </w:p>
           <w:p>
@@ -3226,7 +3226,7 @@
                 <w:sz w:val="20"/>
                 <w:szCs w:val="20"/>
               </w:rPr>
-              <w:t xml:space="preserve">Dept. of Electrical and Electronic Engineering</w:t>
+              <w:t xml:space="preserve">Dept. of Computer Science and Engineering</w:t>
             </w:r>
           </w:p>
           <w:p>

</xml_diff>